<commit_message>
feat: Fase 1 completada + doc v1.1
</commit_message>
<xml_diff>
--- a/docs/documentacion_tecnica.docx
+++ b/docs/documentacion_tecnica.docx
@@ -63,7 +63,7 @@
           <w:sz w:val="20"/>
           <w:szCs w:val="20"/>
         </w:rPr>
-        <w:t xml:space="preserve">Documentación Técnica Viva — v1.0 | Junio 2026</w:t>
+        <w:t xml:space="preserve">Documentación Técnica Viva — v1.1 | Junio 2026</w:t>
       </w:r>
     </w:p>
     <w:p>
@@ -4262,7 +4262,7 @@
                 <w:sz w:val="20"/>
                 <w:szCs w:val="20"/>
               </w:rPr>
-              <w:t xml:space="preserve">Creación de documentación técnica y estructura del repositorio GitHub.</w:t>
+              <w:t xml:space="preserve">Creación de documentación técnica y estructura del repositorio GitHub (prohylurte/auditoria-digi, privado).</w:t>
             </w:r>
           </w:p>
         </w:tc>
@@ -4309,26 +4309,26 @@
               <w:bottom w:val="single" w:color="CCCCCC" w:sz="1"/>
               <w:right w:val="single" w:color="CCCCCC" w:sz="1"/>
             </w:tcBorders>
-            <w:shd w:fill="F2F2F2" w:val="clear"/>
-            <w:tcMar>
-              <w:top w:type="dxa" w:w="80"/>
-              <w:left w:type="dxa" w:w="120"/>
-              <w:bottom w:type="dxa" w:w="80"/>
-              <w:right w:type="dxa" w:w="120"/>
-            </w:tcMar>
-            <w:vAlign w:val="center"/>
-          </w:tcPr>
-          <w:p>
-            <w:r>
-              <w:rPr>
-                <w:rFonts w:ascii="Arial" w:cs="Arial" w:eastAsia="Arial" w:hAnsi="Arial"/>
-                <w:b w:val="false"/>
-                <w:bCs w:val="false"/>
-                <w:color w:val="000000"/>
-                <w:sz w:val="20"/>
-                <w:szCs w:val="20"/>
-              </w:rPr>
-              <w:t xml:space="preserve">—</w:t>
+            <w:shd w:fill="D5F5E3" w:val="clear"/>
+            <w:tcMar>
+              <w:top w:type="dxa" w:w="80"/>
+              <w:left w:type="dxa" w:w="120"/>
+              <w:bottom w:type="dxa" w:w="80"/>
+              <w:right w:type="dxa" w:w="120"/>
+            </w:tcMar>
+            <w:vAlign w:val="center"/>
+          </w:tcPr>
+          <w:p>
+            <w:r>
+              <w:rPr>
+                <w:rFonts w:ascii="Arial" w:cs="Arial" w:eastAsia="Arial" w:hAnsi="Arial"/>
+                <w:b w:val="false"/>
+                <w:bCs w:val="false"/>
+                <w:color w:val="000000"/>
+                <w:sz w:val="20"/>
+                <w:szCs w:val="20"/>
+              </w:rPr>
+              <w:t xml:space="preserve">2026-06-05</w:t>
             </w:r>
           </w:p>
         </w:tc>
@@ -4341,7 +4341,7 @@
               <w:bottom w:val="single" w:color="CCCCCC" w:sz="1"/>
               <w:right w:val="single" w:color="CCCCCC" w:sz="1"/>
             </w:tcBorders>
-            <w:shd w:fill="F2F2F2" w:val="clear"/>
+            <w:shd w:fill="D5F5E3" w:val="clear"/>
             <w:tcMar>
               <w:top w:type="dxa" w:w="80"/>
               <w:left w:type="dxa" w:w="120"/>
@@ -4373,26 +4373,26 @@
               <w:bottom w:val="single" w:color="CCCCCC" w:sz="1"/>
               <w:right w:val="single" w:color="CCCCCC" w:sz="1"/>
             </w:tcBorders>
-            <w:shd w:fill="F2F2F2" w:val="clear"/>
-            <w:tcMar>
-              <w:top w:type="dxa" w:w="80"/>
-              <w:left w:type="dxa" w:w="120"/>
-              <w:bottom w:type="dxa" w:w="80"/>
-              <w:right w:type="dxa" w:w="120"/>
-            </w:tcMar>
-            <w:vAlign w:val="center"/>
-          </w:tcPr>
-          <w:p>
-            <w:r>
-              <w:rPr>
-                <w:rFonts w:ascii="Arial" w:cs="Arial" w:eastAsia="Arial" w:hAnsi="Arial"/>
-                <w:b w:val="false"/>
-                <w:bCs w:val="false"/>
-                <w:color w:val="000000"/>
-                <w:sz w:val="20"/>
-                <w:szCs w:val="20"/>
-              </w:rPr>
-              <w:t xml:space="preserve">Implementar nodos 1-4: ffmpeg, DeepFilterNet 3, Silero VAD, VoxLingua107.</w:t>
+            <w:shd w:fill="D5F5E3" w:val="clear"/>
+            <w:tcMar>
+              <w:top w:type="dxa" w:w="80"/>
+              <w:left w:type="dxa" w:w="120"/>
+              <w:bottom w:type="dxa" w:w="80"/>
+              <w:right w:type="dxa" w:w="120"/>
+            </w:tcMar>
+            <w:vAlign w:val="center"/>
+          </w:tcPr>
+          <w:p>
+            <w:r>
+              <w:rPr>
+                <w:rFonts w:ascii="Arial" w:cs="Arial" w:eastAsia="Arial" w:hAnsi="Arial"/>
+                <w:b w:val="false"/>
+                <w:bCs w:val="false"/>
+                <w:color w:val="000000"/>
+                <w:sz w:val="20"/>
+                <w:szCs w:val="20"/>
+              </w:rPr>
+              <w:t xml:space="preserve">Nodos 1-4 completados. ffmpeg + noisereduce + Silero VAD + VoxLingua107. Resultado: llamada 20min, 20.1% silencios eliminados, idioma ES detectado (74.3% confianza). Sin flags. Nota: noisereduce en Colab, DeepFilterNet 3 en Docker.</w:t>
             </w:r>
           </w:p>
         </w:tc>
@@ -4405,26 +4405,26 @@
               <w:bottom w:val="single" w:color="CCCCCC" w:sz="1"/>
               <w:right w:val="single" w:color="CCCCCC" w:sz="1"/>
             </w:tcBorders>
-            <w:shd w:fill="F2F2F2" w:val="clear"/>
-            <w:tcMar>
-              <w:top w:type="dxa" w:w="80"/>
-              <w:left w:type="dxa" w:w="120"/>
-              <w:bottom w:type="dxa" w:w="80"/>
-              <w:right w:type="dxa" w:w="120"/>
-            </w:tcMar>
-            <w:vAlign w:val="center"/>
-          </w:tcPr>
-          <w:p>
-            <w:r>
-              <w:rPr>
-                <w:rFonts w:ascii="Arial" w:cs="Arial" w:eastAsia="Arial" w:hAnsi="Arial"/>
-                <w:b/>
-                <w:bCs/>
-                <w:color w:val="000000"/>
-                <w:sz w:val="20"/>
-                <w:szCs w:val="20"/>
-              </w:rPr>
-              <w:t xml:space="preserve">Pendiente</w:t>
+            <w:shd w:fill="D5F5E3" w:val="clear"/>
+            <w:tcMar>
+              <w:top w:type="dxa" w:w="80"/>
+              <w:left w:type="dxa" w:w="120"/>
+              <w:bottom w:type="dxa" w:w="80"/>
+              <w:right w:type="dxa" w:w="120"/>
+            </w:tcMar>
+            <w:vAlign w:val="center"/>
+          </w:tcPr>
+          <w:p>
+            <w:r>
+              <w:rPr>
+                <w:rFonts w:ascii="Arial" w:cs="Arial" w:eastAsia="Arial" w:hAnsi="Arial"/>
+                <w:b/>
+                <w:bCs/>
+                <w:color w:val="000000"/>
+                <w:sz w:val="20"/>
+                <w:szCs w:val="20"/>
+              </w:rPr>
+              <w:t xml:space="preserve">Completado</w:t>
             </w:r>
           </w:p>
         </w:tc>
@@ -4522,7 +4522,7 @@
                 <w:sz w:val="20"/>
                 <w:szCs w:val="20"/>
               </w:rPr>
-              <w:t xml:space="preserve">Whisper Medium + alineación + diarización con token real de HuggingFace.</w:t>
+              <w:t xml:space="preserve">Whisper Medium (transcripción) + WhisperX (alineación) + pyannote (diarización, requiere token HuggingFace real).</w:t>
             </w:r>
           </w:p>
         </w:tc>
@@ -4652,7 +4652,7 @@
                 <w:sz w:val="20"/>
                 <w:szCs w:val="20"/>
               </w:rPr>
-              <w:t xml:space="preserve">vLLM + Qwen3-8B (análisis rúbrica) + RAG básico.</w:t>
+              <w:t xml:space="preserve">Ollama + Qwen3-8B Q4 (análisis rúbrica 31 puntos) + RAG básico con BGE-M3.</w:t>
             </w:r>
           </w:p>
         </w:tc>
@@ -4782,7 +4782,7 @@
                 <w:sz w:val="20"/>
                 <w:szCs w:val="20"/>
               </w:rPr>
-              <w:t xml:space="preserve">PDF con gráficos (WeasyPrint) + PostgreSQL.</w:t>
+              <w:t xml:space="preserve">PDF con gráficos (WeasyPrint + Matplotlib) + PostgreSQL.</w:t>
             </w:r>
           </w:p>
         </w:tc>
@@ -4912,7 +4912,7 @@
                 <w:sz w:val="20"/>
                 <w:szCs w:val="20"/>
               </w:rPr>
-              <w:t xml:space="preserve">Imagen Docker completa lista para datacenter.</w:t>
+              <w:t xml:space="preserve">Imagen Docker completa lista para datacenter. DeepFilterNet 3 reemplaza noisereduce.</w:t>
             </w:r>
           </w:p>
         </w:tc>
@@ -5162,7 +5162,7 @@
         <w:sz w:val="18"/>
         <w:szCs w:val="18"/>
       </w:rPr>
-      <w:t xml:space="preserve">		v1.0 | Confidencial</w:t>
+      <w:t xml:space="preserve">		v1.1 | Confidencial</w:t>
     </w:r>
   </w:p>
 </w:hdr>

</xml_diff>

<commit_message>
✅ Fase 2 COMPLETADA: faster-whisper + pyannote, 2 speakers, guion_diarizado.txt
</commit_message>
<xml_diff>
--- a/docs/documentacion_tecnica.docx
+++ b/docs/documentacion_tecnica.docx
@@ -4439,26 +4439,26 @@
               <w:bottom w:val="single" w:color="CCCCCC" w:sz="1"/>
               <w:right w:val="single" w:color="CCCCCC" w:sz="1"/>
             </w:tcBorders>
-            <w:shd w:fill="F2F2F2" w:val="clear"/>
-            <w:tcMar>
-              <w:top w:type="dxa" w:w="80"/>
-              <w:left w:type="dxa" w:w="120"/>
-              <w:bottom w:type="dxa" w:w="80"/>
-              <w:right w:type="dxa" w:w="120"/>
-            </w:tcMar>
-            <w:vAlign w:val="center"/>
-          </w:tcPr>
-          <w:p>
-            <w:r>
-              <w:rPr>
-                <w:rFonts w:ascii="Arial" w:cs="Arial" w:eastAsia="Arial" w:hAnsi="Arial"/>
-                <w:b w:val="false"/>
-                <w:bCs w:val="false"/>
-                <w:color w:val="000000"/>
-                <w:sz w:val="20"/>
-                <w:szCs w:val="20"/>
-              </w:rPr>
-              <w:t xml:space="preserve">—</w:t>
+            <w:shd w:fill="D5F5E3" w:val="clear"/>
+            <w:tcMar>
+              <w:top w:type="dxa" w:w="80"/>
+              <w:left w:type="dxa" w:w="120"/>
+              <w:bottom w:type="dxa" w:w="80"/>
+              <w:right w:type="dxa" w:w="120"/>
+            </w:tcMar>
+            <w:vAlign w:val="center"/>
+          </w:tcPr>
+          <w:p>
+            <w:r>
+              <w:rPr>
+                <w:rFonts w:ascii="Arial" w:cs="Arial" w:eastAsia="Arial" w:hAnsi="Arial"/>
+                <w:b w:val="false"/>
+                <w:bCs w:val="false"/>
+                <w:color w:val="000000"/>
+                <w:sz w:val="20"/>
+                <w:szCs w:val="20"/>
+              </w:rPr>
+              <w:t xml:space="preserve">2026-06-06</w:t>
             </w:r>
           </w:p>
         </w:tc>
@@ -4471,26 +4471,26 @@
               <w:bottom w:val="single" w:color="CCCCCC" w:sz="1"/>
               <w:right w:val="single" w:color="CCCCCC" w:sz="1"/>
             </w:tcBorders>
-            <w:shd w:fill="F2F2F2" w:val="clear"/>
-            <w:tcMar>
-              <w:top w:type="dxa" w:w="80"/>
-              <w:left w:type="dxa" w:w="120"/>
-              <w:bottom w:type="dxa" w:w="80"/>
-              <w:right w:type="dxa" w:w="120"/>
-            </w:tcMar>
-            <w:vAlign w:val="center"/>
-          </w:tcPr>
-          <w:p>
-            <w:r>
-              <w:rPr>
-                <w:rFonts w:ascii="Arial" w:cs="Arial" w:eastAsia="Arial" w:hAnsi="Arial"/>
-                <w:b/>
-                <w:bCs/>
-                <w:color w:val="000000"/>
-                <w:sz w:val="20"/>
-                <w:szCs w:val="20"/>
-              </w:rPr>
-              <w:t xml:space="preserve">Fase 2 - ASR</w:t>
+            <w:shd w:fill="D5F5E3" w:val="clear"/>
+            <w:tcMar>
+              <w:top w:type="dxa" w:w="80"/>
+              <w:left w:type="dxa" w:w="120"/>
+              <w:bottom w:type="dxa" w:w="80"/>
+              <w:right w:type="dxa" w:w="120"/>
+            </w:tcMar>
+            <w:vAlign w:val="center"/>
+          </w:tcPr>
+          <w:p>
+            <w:r>
+              <w:rPr>
+                <w:rFonts w:ascii="Arial" w:cs="Arial" w:eastAsia="Arial" w:hAnsi="Arial"/>
+                <w:b/>
+                <w:bCs/>
+                <w:color w:val="000000"/>
+                <w:sz w:val="20"/>
+                <w:szCs w:val="20"/>
+              </w:rPr>
+              <w:t xml:space="preserve">Fase 2 - Transcripcion</w:t>
             </w:r>
           </w:p>
         </w:tc>
@@ -4503,26 +4503,26 @@
               <w:bottom w:val="single" w:color="CCCCCC" w:sz="1"/>
               <w:right w:val="single" w:color="CCCCCC" w:sz="1"/>
             </w:tcBorders>
-            <w:shd w:fill="F2F2F2" w:val="clear"/>
-            <w:tcMar>
-              <w:top w:type="dxa" w:w="80"/>
-              <w:left w:type="dxa" w:w="120"/>
-              <w:bottom w:type="dxa" w:w="80"/>
-              <w:right w:type="dxa" w:w="120"/>
-            </w:tcMar>
-            <w:vAlign w:val="center"/>
-          </w:tcPr>
-          <w:p>
-            <w:r>
-              <w:rPr>
-                <w:rFonts w:ascii="Arial" w:cs="Arial" w:eastAsia="Arial" w:hAnsi="Arial"/>
-                <w:b w:val="false"/>
-                <w:bCs w:val="false"/>
-                <w:color w:val="000000"/>
-                <w:sz w:val="20"/>
-                <w:szCs w:val="20"/>
-              </w:rPr>
-              <w:t xml:space="preserve">Whisper Medium (transcripción) + WhisperX (alineación) + pyannote (diarización, requiere token HuggingFace real).</w:t>
+            <w:shd w:fill="D5F5E3" w:val="clear"/>
+            <w:tcMar>
+              <w:top w:type="dxa" w:w="80"/>
+              <w:left w:type="dxa" w:w="120"/>
+              <w:bottom w:type="dxa" w:w="80"/>
+              <w:right w:type="dxa" w:w="120"/>
+            </w:tcMar>
+            <w:vAlign w:val="center"/>
+          </w:tcPr>
+          <w:p>
+            <w:r>
+              <w:rPr>
+                <w:rFonts w:ascii="Arial" w:cs="Arial" w:eastAsia="Arial" w:hAnsi="Arial"/>
+                <w:b w:val="false"/>
+                <w:bCs w:val="false"/>
+                <w:color w:val="000000"/>
+                <w:sz w:val="20"/>
+                <w:szCs w:val="20"/>
+              </w:rPr>
+              <w:t xml:space="preserve">Nodos 5+8+9 completados. faster-whisper Medium (word_timestamps nativo, sin conflicto NumPy 2.x) + pyannote 3.1 (API token, tensor input). Resultado: 2 interlocutores detectados, 3 intervenciones, guion_diarizado.txt generado. Nota: Docker usara WhisperX + Large V3.</w:t>
             </w:r>
           </w:p>
         </w:tc>
@@ -4535,26 +4535,26 @@
               <w:bottom w:val="single" w:color="CCCCCC" w:sz="1"/>
               <w:right w:val="single" w:color="CCCCCC" w:sz="1"/>
             </w:tcBorders>
-            <w:shd w:fill="F2F2F2" w:val="clear"/>
-            <w:tcMar>
-              <w:top w:type="dxa" w:w="80"/>
-              <w:left w:type="dxa" w:w="120"/>
-              <w:bottom w:type="dxa" w:w="80"/>
-              <w:right w:type="dxa" w:w="120"/>
-            </w:tcMar>
-            <w:vAlign w:val="center"/>
-          </w:tcPr>
-          <w:p>
-            <w:r>
-              <w:rPr>
-                <w:rFonts w:ascii="Arial" w:cs="Arial" w:eastAsia="Arial" w:hAnsi="Arial"/>
-                <w:b/>
-                <w:bCs/>
-                <w:color w:val="000000"/>
-                <w:sz w:val="20"/>
-                <w:szCs w:val="20"/>
-              </w:rPr>
-              <w:t xml:space="preserve">Pendiente</w:t>
+            <w:shd w:fill="D5F5E3" w:val="clear"/>
+            <w:tcMar>
+              <w:top w:type="dxa" w:w="80"/>
+              <w:left w:type="dxa" w:w="120"/>
+              <w:bottom w:type="dxa" w:w="80"/>
+              <w:right w:type="dxa" w:w="120"/>
+            </w:tcMar>
+            <w:vAlign w:val="center"/>
+          </w:tcPr>
+          <w:p>
+            <w:r>
+              <w:rPr>
+                <w:rFonts w:ascii="Arial" w:cs="Arial" w:eastAsia="Arial" w:hAnsi="Arial"/>
+                <w:b/>
+                <w:bCs/>
+                <w:color w:val="000000"/>
+                <w:sz w:val="20"/>
+                <w:szCs w:val="20"/>
+              </w:rPr>
+              <w:t xml:space="preserve">Completado</w:t>
             </w:r>
           </w:p>
         </w:tc>

</xml_diff>